<commit_message>
0026-spec-cycle: feature-list -- Here are the comments:
</commit_message>
<xml_diff>
--- a/specs/000-comments.docx
+++ b/specs/000-comments.docx
@@ -742,6 +742,196 @@
       </w:r>
       <w:r>
         <w:t xml:space="preserve"> Let’s just store them in a separate JSON. The optical constructor is a complicated UI piece. I want it build first before doing anything else.</w:t>
+      </w:r>
+    </w:p>
+    <w:p>
+      <w:r>
+        <w:br w:type="page"/>
+      </w:r>
+    </w:p>
+    <w:p>
+      <w:r>
+        <w:lastRenderedPageBreak/>
+        <w:t>Here are the comments:</w:t>
+      </w:r>
+    </w:p>
+    <w:p>
+      <w:r>
+        <w:t>All keys and duplicate mouse commands (where applicable) must be in one centralized locations. Since this is F#, then we model the command using DUs and then assemble one or two variants using a 3 state DU (KB only, mouse only, KB + mouse – or something like that – that will be a design decision, here we just make some small notes).</w:t>
+      </w:r>
+    </w:p>
+    <w:p>
+      <w:r>
+        <w:t>`</w:t>
+      </w:r>
+      <w:r>
+        <w:t>For a polarizer R1 is its azimuth.</w:t>
+      </w:r>
+      <w:r>
+        <w:t>` - I think that this is wrong. R1 is a normal to the face but azimuth is on the face. R2 is the azimuth at (0, 0, 0)</w:t>
+      </w:r>
+    </w:p>
+    <w:p/>
+    <w:p>
+      <w:r>
+        <w:t>`</w:t>
+      </w:r>
+      <w:r>
+        <w:t>Showing and editing the angles.</w:t>
+      </w:r>
+      <w:r>
+        <w:t>` - The user does not edit angles one by one. All that happens when a local element menu is shown.</w:t>
+      </w:r>
+    </w:p>
+    <w:p/>
+    <w:p>
+      <w:r>
+        <w:t>`</w:t>
+      </w:r>
+      <w:r>
+        <w:t>Placement point and snapping</w:t>
+      </w:r>
+      <w:r>
+        <w:t>` PP snaps to CR. Changing R2 and / or R3 will change the direction of R and may change the direction of T. Anything that is snapped to the ray(s) after the element that is being rotated must travel with the ray(s) and all the distances are preserved.</w:t>
+      </w:r>
+      <w:r>
+        <w:t xml:space="preserve"> The placement point can be edited at the same local element menu where the angles are. Basically everything that we do with the element can be done via that menu.</w:t>
+      </w:r>
+      <w:r>
+        <w:t xml:space="preserve"> </w:t>
+      </w:r>
+    </w:p>
+    <w:p/>
+    <w:p>
+      <w:r>
+        <w:t xml:space="preserve">Light source and the detector have default placement locations: Light source near the left side of the table in the middle and detector is near the right side of the table in the middle. The distances are measured from the beginning of the CR originating at the light source and terminates at the detector. The initial distance between them is 2 meters. Moving the light source drags everything with it due to snapping. The </w:t>
+      </w:r>
+      <w:r>
+        <w:t>light source</w:t>
+      </w:r>
+      <w:r>
+        <w:t xml:space="preserve"> must have a </w:t>
+      </w:r>
+      <w:r>
+        <w:t xml:space="preserve">position </w:t>
+      </w:r>
+      <w:r>
+        <w:t xml:space="preserve">reset (via </w:t>
+      </w:r>
+      <w:r>
+        <w:t xml:space="preserve">its </w:t>
+      </w:r>
+      <w:r>
+        <w:t>menu)</w:t>
+      </w:r>
+      <w:r>
+        <w:t>. The rest will just re</w:t>
+      </w:r>
+      <w:r>
+        <w:t>-</w:t>
+      </w:r>
+      <w:r>
+        <w:t>snap.</w:t>
+      </w:r>
+    </w:p>
+    <w:p/>
+    <w:p>
+      <w:r>
+        <w:t>Changing the tracked ray (e.g. from T to R) or removing the ray when both are used makes the elements on the way of removed ray orphaned. This is the only way to have orphaned elements. If the ray is restored, then they re-snap (if the ray passes within some configured distance from PP). Otherwise</w:t>
+      </w:r>
+      <w:r>
+        <w:t>,</w:t>
+      </w:r>
+      <w:r>
+        <w:t xml:space="preserve"> the </w:t>
+      </w:r>
+      <w:r>
+        <w:t>elements stay orphaned.</w:t>
+      </w:r>
+    </w:p>
+    <w:p/>
+    <w:p>
+      <w:r>
+        <w:t xml:space="preserve">When an </w:t>
+      </w:r>
+      <w:r>
+        <w:t xml:space="preserve">element is placed on a ray that is not horizontal </w:t>
+      </w:r>
+      <w:r>
+        <w:t xml:space="preserve">then R2 is always measured from the ray direction. </w:t>
+      </w:r>
+      <w:r>
+        <w:t xml:space="preserve">That means that if an element is on a horizontal ray with some R2 and </w:t>
+      </w:r>
+      <w:r>
+        <w:lastRenderedPageBreak/>
+        <w:t xml:space="preserve">then is placed on a non-horizontal ray with some r2, then in table system of coordinates the element has (r2 + R2) angle of rotation. </w:t>
+      </w:r>
+    </w:p>
+    <w:p/>
+    <w:p>
+      <w:r>
+        <w:t>SHIFT</w:t>
+      </w:r>
+      <w:r>
+        <w:t xml:space="preserve"> + LEFT-PRESS + DRAG</w:t>
+      </w:r>
+      <w:r>
+        <w:t xml:space="preserve"> – only drags the element within the boundaries of two elements that are on both sides of the current element.</w:t>
+      </w:r>
+      <w:r>
+        <w:t xml:space="preserve"> </w:t>
+      </w:r>
+      <w:r>
+        <w:t>Once the element is dropped the table is redrawn as the rays may change</w:t>
+      </w:r>
+      <w:r>
+        <w:t>.</w:t>
+      </w:r>
+      <w:r>
+        <w:t xml:space="preserve"> Shift left / right do the same.</w:t>
+      </w:r>
+    </w:p>
+    <w:p>
+      <w:r>
+        <w:t>CTL + LEFT-PRESS + DRAG element allows dragging the elements between different rays.</w:t>
+      </w:r>
+      <w:r>
+        <w:t xml:space="preserve"> Once the element is dropped the table is redrawn as the rays may change.</w:t>
+      </w:r>
+    </w:p>
+    <w:p/>
+    <w:p>
+      <w:r>
+        <w:t>Editing</w:t>
+      </w:r>
+      <w:r>
+        <w:t>:</w:t>
+      </w:r>
+      <w:r>
+        <w:t xml:space="preserve"> drag elements from the ribbon to the table. The elements snap to the middle of the closest CR path when </w:t>
+      </w:r>
+      <w:r>
+        <w:t>the element is dropped (mouse released).</w:t>
+      </w:r>
+    </w:p>
+    <w:p/>
+    <w:p>
+      <w:r>
+        <w:t>Element group refinement</w:t>
+      </w:r>
+      <w:r>
+        <w:t>. The purpose of the element group is to simplify the process making similar experiments out of the same setup. For example, we want to swap LP and CP without getting into a complicated process of adding LP, specifying its fine details, and then removing it by placing a CP and specifying its details and then back. The elements in the group may go either into same way (only one is allowed) OR zero, one, or more could be placed at the same time. So a group allows describing all elements in it and that easy swapping</w:t>
+      </w:r>
+      <w:r>
+        <w:t xml:space="preserve"> without losing the information about the element, which would be the case with simple delete / add.</w:t>
+      </w:r>
+    </w:p>
+    <w:p/>
+    <w:p/>
+    <w:p>
+      <w:r>
+        <w:t>Experiment part</w:t>
       </w:r>
     </w:p>
     <w:p>

</xml_diff>

<commit_message>
0026-spec-cycle: spec -- Examine the existing codebase, look up the web…
</commit_message>
<xml_diff>
--- a/specs/000-comments.docx
+++ b/specs/000-comments.docx
@@ -93,7 +93,15 @@
         <w:t>Units of measure</w:t>
       </w:r>
       <w:r>
-        <w:t xml:space="preserve"> – m, cm, mm, mkm, nm, A, and in in case somebody wants them. </w:t>
+        <w:t xml:space="preserve"> – m, cm, mm, </w:t>
+      </w:r>
+      <w:proofErr w:type="spellStart"/>
+      <w:r>
+        <w:t>mkm</w:t>
+      </w:r>
+      <w:proofErr w:type="spellEnd"/>
+      <w:r>
+        <w:t xml:space="preserve">, nm, A, and in in case somebody wants them. </w:t>
       </w:r>
       <w:r>
         <w:t xml:space="preserve">A lot </w:t>
@@ -649,7 +657,15 @@
         <w:t xml:space="preserve"> The drawer is a function, which given the placement point and 3 rotations will draw the element. Let’s start from all elements being cylinders and one standard drawer that will draw all the elements as cylinder frame and very light gray transparent inside so that we can see the rays. The light source should have darker color, and the detector must be almost black but the frame must be still visible.</w:t>
       </w:r>
       <w:r>
-        <w:t xml:space="preserve"> The drawer must support an option to show / hide bounding box. This is convenient to visualize the rotations.</w:t>
+        <w:t xml:space="preserve"> The drawer must support </w:t>
+      </w:r>
+      <w:proofErr w:type="spellStart"/>
+      <w:r>
+        <w:t>an</w:t>
+      </w:r>
+      <w:proofErr w:type="spellEnd"/>
+      <w:r>
+        <w:t xml:space="preserve"> option to show / hide bounding box. This is convenient to visualize the rotations.</w:t>
       </w:r>
       <w:r>
         <w:t xml:space="preserve"> The choice of R1, R2, R3 is dictated by the construction of optical fittings. As a result, if R3 is non</w:t>
@@ -976,6 +992,19 @@
         <w:t>PP is the center of the rectangular bounding box.</w:t>
       </w:r>
     </w:p>
+    <w:p/>
+    <w:p>
+      <w:r>
+        <w:br w:type="page"/>
+      </w:r>
+    </w:p>
+    <w:p/>
+    <w:p>
+      <w:r>
+        <w:t>Write the spec based on the feature list.</w:t>
+      </w:r>
+    </w:p>
+    <w:p/>
     <w:p/>
     <w:p>
       <w:r>

</xml_diff>